<commit_message>
readme: documentar modo borrador2
</commit_message>
<xml_diff>
--- a/amaal/reportes/Informe_Pasantia_IUTECP_BORRADOR2.docx
+++ b/amaal/reportes/Informe_Pasantia_IUTECP_BORRADOR2.docx
@@ -214,7 +214,7 @@
           <w:b/>
           <w:sz w:val="24"/>
         </w:rPr>
-        <w:t>Tutor Industrial: [Nombre del Tutor Industrial]</w:t>
+        <w:t>Tutor Industrial: Lenny Mata</w:t>
         <w:br/>
       </w:r>
       <w:r>
@@ -223,7 +223,7 @@
           <w:b/>
           <w:sz w:val="24"/>
         </w:rPr>
-        <w:t>C.I.: [Cédula del Tutor Industrial]</w:t>
+        <w:t>C.I.: 8969750</w:t>
         <w:br/>
       </w:r>
       <w:r>

</xml_diff>